<commit_message>
docs(sales): test plan v3 — thêm ví dụ cụ thể tab Vận chuyển (SO-2026-0018)
Section mới "Ví dụ cụ thể — Tab Vận chuyển (SO-2026-0018)" với:
- Thông tin order nền (SVR_3L 20 tấn, FOB, Cát Lái → Yokohama)
- 6 sub-section bảng giá trị mẫu thực tế:
  · BOOKING & TÀU — Maersk, MAEU240511-0018, MAERSK KINLOSS/2618E
  · VẬN ĐƠN (B/L) — Original type, MAEU-BL-0018-20260515
  · NGÀY THÁNG — ETD 15/05, ETA 12/06, Cutoff 13/05
  · DHL Tracking
  · L/C — LC-JP-20260425-018, MUFG Tokyo, hạn 15/07, 43104 USD
  · ĐẶT CỌC — 8620.80 USD (20%), 10/05/2026, TT via VCB
  · CHIẾT KHẤU — 34483.20 USD (80%), phí NH 250
- 10 bước thao tác test [Hậu cần] + [SQL] verify 17 field
- Công thức Còn lại = Thành tiền − Đặt cọc − Chiết khấu − Phí NH

File v3 consolidate vào SALES_MODULE_TEST_PLAN.docx (~53KB, ~20 trang A4)

Co-Authored-By: Claude Opus 4.7 (1M context) <noreply@anthropic.com>
</commit_message>
<xml_diff>
--- a/docs/SALES_MODULE_TEST_PLAN.docx
+++ b/docs/SALES_MODULE_TEST_PLAN.docx
@@ -7909,6 +7909,1770 @@
       </w:pPr>
       <w:r>
         <w:t>Alerts không cập nhật</w:t>
+      </w:r>
+    </w:p>
+    <w:p>
+      <w:r>
+        <w:br w:type="page"/>
+      </w:r>
+    </w:p>
+    <w:p>
+      <w:pPr>
+        <w:spacing w:before="280" w:after="120"/>
+      </w:pPr>
+      <w:r>
+        <w:rPr>
+          <w:b/>
+          <w:color w:val="1B4D3E"/>
+          <w:sz w:val="28"/>
+        </w:rPr>
+        <w:t>Ví dụ cụ thể — Tab Vận chuyển (SO-2026-0018)</w:t>
+      </w:r>
+    </w:p>
+    <w:p>
+      <w:r>
+        <w:rPr>
+          <w:b w:val="0"/>
+          <w:i/>
+          <w:color w:val="555555"/>
+          <w:sz w:val="22"/>
+        </w:rPr>
+        <w:t>Scenario thực tế: đơn SVR_3L 20 tấn xuất từ cảng Cát Lái → Yokohama (Nhật Bản), FOB, L/C at sight. Điền đúng các field sau để pass test tab Vận chuyển.</w:t>
+      </w:r>
+    </w:p>
+    <w:p>
+      <w:pPr>
+        <w:spacing w:before="160"/>
+      </w:pPr>
+      <w:r>
+        <w:rPr>
+          <w:b/>
+          <w:color w:val="1B4D3E"/>
+          <w:sz w:val="24"/>
+        </w:rPr>
+        <w:t>Thông tin order nền</w:t>
+      </w:r>
+    </w:p>
+    <w:p>
+      <w:pPr>
+        <w:pStyle w:val="ListBullet"/>
+        <w:ind w:left="283"/>
+      </w:pPr>
+      <w:r>
+        <w:t>Số HĐ: SO-2026-0018  ·  Status: Sẵn sàng (ready)  ·  Customer: KH-TEST-01</w:t>
+      </w:r>
+    </w:p>
+    <w:p>
+      <w:pPr>
+        <w:pStyle w:val="ListBullet"/>
+        <w:ind w:left="283"/>
+      </w:pPr>
+      <w:r>
+        <w:t>Grade: SVR_3L  ·  Số lượng: 20 tấn (19.200 kg allocated)  ·  Incoterm: FOB</w:t>
+      </w:r>
+    </w:p>
+    <w:p>
+      <w:pPr>
+        <w:pStyle w:val="ListBullet"/>
+        <w:ind w:left="283"/>
+      </w:pPr>
+      <w:r>
+        <w:t>Giá trị: 43.104 USD  ·  Tiền tệ: USD  ·  Cảng xếp: Cát Lái  ·  Cảng đích: Yokohama</w:t>
+      </w:r>
+    </w:p>
+    <w:p>
+      <w:pPr>
+        <w:spacing w:before="160"/>
+      </w:pPr>
+      <w:r>
+        <w:rPr>
+          <w:b/>
+          <w:color w:val="1B4D3E"/>
+          <w:sz w:val="24"/>
+        </w:rPr>
+        <w:t>Section 🚢 BOOKING &amp; TÀU</w:t>
+      </w:r>
+    </w:p>
+    <w:tbl>
+      <w:tblPr>
+        <w:tblStyle w:val="LightGrid-Accent1"/>
+        <w:tblW w:type="auto" w:w="0"/>
+        <w:tblLook w:firstColumn="1" w:firstRow="1" w:lastColumn="0" w:lastRow="0" w:noHBand="0" w:noVBand="1" w:val="04A0"/>
+      </w:tblPr>
+      <w:tblGrid>
+        <w:gridCol w:w="3324"/>
+        <w:gridCol w:w="3324"/>
+        <w:gridCol w:w="3324"/>
+      </w:tblGrid>
+      <w:tr>
+        <w:tc>
+          <w:tcPr>
+            <w:tcW w:type="dxa" w:w="3324"/>
+          </w:tcPr>
+          <w:p>
+            <w:r>
+              <w:rPr>
+                <w:b/>
+              </w:rPr>
+              <w:t>Field</w:t>
+            </w:r>
+          </w:p>
+        </w:tc>
+        <w:tc>
+          <w:tcPr>
+            <w:tcW w:type="dxa" w:w="3324"/>
+          </w:tcPr>
+          <w:p>
+            <w:r>
+              <w:rPr>
+                <w:b/>
+              </w:rPr>
+              <w:t>Placeholder UI</w:t>
+            </w:r>
+          </w:p>
+        </w:tc>
+        <w:tc>
+          <w:tcPr>
+            <w:tcW w:type="dxa" w:w="3324"/>
+          </w:tcPr>
+          <w:p>
+            <w:r>
+              <w:rPr>
+                <w:b/>
+              </w:rPr>
+              <w:t>Giá trị ví dụ</w:t>
+            </w:r>
+          </w:p>
+        </w:tc>
+      </w:tr>
+      <w:tr>
+        <w:tc>
+          <w:tcPr>
+            <w:tcW w:type="dxa" w:w="3324"/>
+          </w:tcPr>
+          <w:p>
+            <w:r>
+              <w:t>Hãng tàu</w:t>
+            </w:r>
+          </w:p>
+        </w:tc>
+        <w:tc>
+          <w:tcPr>
+            <w:tcW w:type="dxa" w:w="3324"/>
+          </w:tcPr>
+          <w:p>
+            <w:r>
+              <w:t>Maersk, MSC...</w:t>
+            </w:r>
+          </w:p>
+        </w:tc>
+        <w:tc>
+          <w:tcPr>
+            <w:tcW w:type="dxa" w:w="3324"/>
+          </w:tcPr>
+          <w:p>
+            <w:r>
+              <w:t>Maersk</w:t>
+            </w:r>
+          </w:p>
+        </w:tc>
+      </w:tr>
+      <w:tr>
+        <w:tc>
+          <w:tcPr>
+            <w:tcW w:type="dxa" w:w="3324"/>
+          </w:tcPr>
+          <w:p>
+            <w:r>
+              <w:t>Booking Ref</w:t>
+            </w:r>
+          </w:p>
+        </w:tc>
+        <w:tc>
+          <w:tcPr>
+            <w:tcW w:type="dxa" w:w="3324"/>
+          </w:tcPr>
+          <w:p>
+            <w:r>
+              <w:t>Booking number</w:t>
+            </w:r>
+          </w:p>
+        </w:tc>
+        <w:tc>
+          <w:tcPr>
+            <w:tcW w:type="dxa" w:w="3324"/>
+          </w:tcPr>
+          <w:p>
+            <w:r>
+              <w:t>MAEU240511-0018</w:t>
+            </w:r>
+          </w:p>
+        </w:tc>
+      </w:tr>
+      <w:tr>
+        <w:tc>
+          <w:tcPr>
+            <w:tcW w:type="dxa" w:w="3324"/>
+          </w:tcPr>
+          <w:p>
+            <w:r>
+              <w:t>Tàu / Chuyến</w:t>
+            </w:r>
+          </w:p>
+        </w:tc>
+        <w:tc>
+          <w:tcPr>
+            <w:tcW w:type="dxa" w:w="3324"/>
+          </w:tcPr>
+          <w:p>
+            <w:r>
+              <w:t>VD: MSC ANNA / VY2604E</w:t>
+            </w:r>
+          </w:p>
+        </w:tc>
+        <w:tc>
+          <w:tcPr>
+            <w:tcW w:type="dxa" w:w="3324"/>
+          </w:tcPr>
+          <w:p>
+            <w:r>
+              <w:t>MAERSK KINLOSS / 2618E</w:t>
+            </w:r>
+          </w:p>
+        </w:tc>
+      </w:tr>
+    </w:tbl>
+    <w:p>
+      <w:pPr>
+        <w:spacing w:before="160"/>
+      </w:pPr>
+      <w:r>
+        <w:rPr>
+          <w:b/>
+          <w:color w:val="1B4D3E"/>
+          <w:sz w:val="24"/>
+        </w:rPr>
+        <w:t>Section 📜 VẬN ĐƠN (B/L)</w:t>
+      </w:r>
+    </w:p>
+    <w:tbl>
+      <w:tblPr>
+        <w:tblStyle w:val="LightGrid-Accent1"/>
+        <w:tblW w:type="auto" w:w="0"/>
+        <w:tblLook w:firstColumn="1" w:firstRow="1" w:lastColumn="0" w:lastRow="0" w:noHBand="0" w:noVBand="1" w:val="04A0"/>
+      </w:tblPr>
+      <w:tblGrid>
+        <w:gridCol w:w="3324"/>
+        <w:gridCol w:w="3324"/>
+        <w:gridCol w:w="3324"/>
+      </w:tblGrid>
+      <w:tr>
+        <w:tc>
+          <w:tcPr>
+            <w:tcW w:type="dxa" w:w="3324"/>
+          </w:tcPr>
+          <w:p>
+            <w:r>
+              <w:rPr>
+                <w:b/>
+              </w:rPr>
+              <w:t>Field</w:t>
+            </w:r>
+          </w:p>
+        </w:tc>
+        <w:tc>
+          <w:tcPr>
+            <w:tcW w:type="dxa" w:w="3324"/>
+          </w:tcPr>
+          <w:p>
+            <w:r>
+              <w:rPr>
+                <w:b/>
+              </w:rPr>
+              <w:t>Placeholder</w:t>
+            </w:r>
+          </w:p>
+        </w:tc>
+        <w:tc>
+          <w:tcPr>
+            <w:tcW w:type="dxa" w:w="3324"/>
+          </w:tcPr>
+          <w:p>
+            <w:r>
+              <w:rPr>
+                <w:b/>
+              </w:rPr>
+              <w:t>Giá trị ví dụ</w:t>
+            </w:r>
+          </w:p>
+        </w:tc>
+      </w:tr>
+      <w:tr>
+        <w:tc>
+          <w:tcPr>
+            <w:tcW w:type="dxa" w:w="3324"/>
+          </w:tcPr>
+          <w:p>
+            <w:r>
+              <w:t>B/L Number</w:t>
+            </w:r>
+          </w:p>
+        </w:tc>
+        <w:tc>
+          <w:tcPr>
+            <w:tcW w:type="dxa" w:w="3324"/>
+          </w:tcPr>
+          <w:p>
+            <w:r>
+              <w:t>B/L number</w:t>
+            </w:r>
+          </w:p>
+        </w:tc>
+        <w:tc>
+          <w:tcPr>
+            <w:tcW w:type="dxa" w:w="3324"/>
+          </w:tcPr>
+          <w:p>
+            <w:r>
+              <w:t>MAEU-BL-0018-20260515</w:t>
+            </w:r>
+          </w:p>
+        </w:tc>
+      </w:tr>
+      <w:tr>
+        <w:tc>
+          <w:tcPr>
+            <w:tcW w:type="dxa" w:w="3324"/>
+          </w:tcPr>
+          <w:p>
+            <w:r>
+              <w:t>B/L Type</w:t>
+            </w:r>
+          </w:p>
+        </w:tc>
+        <w:tc>
+          <w:tcPr>
+            <w:tcW w:type="dxa" w:w="3324"/>
+          </w:tcPr>
+          <w:p>
+            <w:r>
+              <w:t>Chọn...</w:t>
+            </w:r>
+          </w:p>
+        </w:tc>
+        <w:tc>
+          <w:tcPr>
+            <w:tcW w:type="dxa" w:w="3324"/>
+          </w:tcPr>
+          <w:p>
+            <w:r>
+              <w:t>Original  (hoặc Telex Release / Surrendered)</w:t>
+            </w:r>
+          </w:p>
+        </w:tc>
+      </w:tr>
+    </w:tbl>
+    <w:p>
+      <w:r>
+        <w:rPr>
+          <w:b w:val="0"/>
+          <w:i/>
+          <w:color w:val="555555"/>
+          <w:sz w:val="20"/>
+        </w:rPr>
+        <w:t>Ghi chú: B/L Type dropdown 3 options — chọn "Original" cho FOB/CIF thông thường, "Telex Release" khi người nhận cần lấy hàng mà chưa nhận B/L gốc, "Surrendered" khi đã nộp bản gốc cho hãng tàu.</w:t>
+      </w:r>
+    </w:p>
+    <w:p>
+      <w:pPr>
+        <w:spacing w:before="160"/>
+      </w:pPr>
+      <w:r>
+        <w:rPr>
+          <w:b/>
+          <w:color w:val="1B4D3E"/>
+          <w:sz w:val="24"/>
+        </w:rPr>
+        <w:t>Section 📅 NGÀY THÁNG</w:t>
+      </w:r>
+    </w:p>
+    <w:tbl>
+      <w:tblPr>
+        <w:tblStyle w:val="LightGrid-Accent1"/>
+        <w:tblW w:type="auto" w:w="0"/>
+        <w:tblLook w:firstColumn="1" w:firstRow="1" w:lastColumn="0" w:lastRow="0" w:noHBand="0" w:noVBand="1" w:val="04A0"/>
+      </w:tblPr>
+      <w:tblGrid>
+        <w:gridCol w:w="3324"/>
+        <w:gridCol w:w="3324"/>
+        <w:gridCol w:w="3324"/>
+      </w:tblGrid>
+      <w:tr>
+        <w:tc>
+          <w:tcPr>
+            <w:tcW w:type="dxa" w:w="3324"/>
+          </w:tcPr>
+          <w:p>
+            <w:r>
+              <w:rPr>
+                <w:b/>
+              </w:rPr>
+              <w:t>Field</w:t>
+            </w:r>
+          </w:p>
+        </w:tc>
+        <w:tc>
+          <w:tcPr>
+            <w:tcW w:type="dxa" w:w="3324"/>
+          </w:tcPr>
+          <w:p>
+            <w:r>
+              <w:rPr>
+                <w:b/>
+              </w:rPr>
+              <w:t>Ý nghĩa</w:t>
+            </w:r>
+          </w:p>
+        </w:tc>
+        <w:tc>
+          <w:tcPr>
+            <w:tcW w:type="dxa" w:w="3324"/>
+          </w:tcPr>
+          <w:p>
+            <w:r>
+              <w:rPr>
+                <w:b/>
+              </w:rPr>
+              <w:t>Giá trị ví dụ (DD/MM/YYYY)</w:t>
+            </w:r>
+          </w:p>
+        </w:tc>
+      </w:tr>
+      <w:tr>
+        <w:tc>
+          <w:tcPr>
+            <w:tcW w:type="dxa" w:w="3324"/>
+          </w:tcPr>
+          <w:p>
+            <w:r>
+              <w:t>ETD</w:t>
+            </w:r>
+          </w:p>
+        </w:tc>
+        <w:tc>
+          <w:tcPr>
+            <w:tcW w:type="dxa" w:w="3324"/>
+          </w:tcPr>
+          <w:p>
+            <w:r>
+              <w:t>Estimated Time of Departure (ngày tàu rời cảng xếp)</w:t>
+            </w:r>
+          </w:p>
+        </w:tc>
+        <w:tc>
+          <w:tcPr>
+            <w:tcW w:type="dxa" w:w="3324"/>
+          </w:tcPr>
+          <w:p>
+            <w:r>
+              <w:t>15/05/2026</w:t>
+            </w:r>
+          </w:p>
+        </w:tc>
+      </w:tr>
+      <w:tr>
+        <w:tc>
+          <w:tcPr>
+            <w:tcW w:type="dxa" w:w="3324"/>
+          </w:tcPr>
+          <w:p>
+            <w:r>
+              <w:t>ETA</w:t>
+            </w:r>
+          </w:p>
+        </w:tc>
+        <w:tc>
+          <w:tcPr>
+            <w:tcW w:type="dxa" w:w="3324"/>
+          </w:tcPr>
+          <w:p>
+            <w:r>
+              <w:t>Estimated Time of Arrival (ngày tàu đến cảng đích)</w:t>
+            </w:r>
+          </w:p>
+        </w:tc>
+        <w:tc>
+          <w:tcPr>
+            <w:tcW w:type="dxa" w:w="3324"/>
+          </w:tcPr>
+          <w:p>
+            <w:r>
+              <w:t>12/06/2026</w:t>
+            </w:r>
+          </w:p>
+        </w:tc>
+      </w:tr>
+      <w:tr>
+        <w:tc>
+          <w:tcPr>
+            <w:tcW w:type="dxa" w:w="3324"/>
+          </w:tcPr>
+          <w:p>
+            <w:r>
+              <w:t>Cutoff</w:t>
+            </w:r>
+          </w:p>
+        </w:tc>
+        <w:tc>
+          <w:tcPr>
+            <w:tcW w:type="dxa" w:w="3324"/>
+          </w:tcPr>
+          <w:p>
+            <w:r>
+              <w:t>Hạn cutoff — chốt container vào cảng trước giờ này</w:t>
+            </w:r>
+          </w:p>
+        </w:tc>
+        <w:tc>
+          <w:tcPr>
+            <w:tcW w:type="dxa" w:w="3324"/>
+          </w:tcPr>
+          <w:p>
+            <w:r>
+              <w:t>13/05/2026 (trước ETD 2 ngày)</w:t>
+            </w:r>
+          </w:p>
+        </w:tc>
+      </w:tr>
+    </w:tbl>
+    <w:p>
+      <w:pPr>
+        <w:spacing w:before="160"/>
+      </w:pPr>
+      <w:r>
+        <w:rPr>
+          <w:b/>
+          <w:color w:val="1B4D3E"/>
+          <w:sz w:val="24"/>
+        </w:rPr>
+        <w:t>Section 📦 DHL Tracking</w:t>
+      </w:r>
+    </w:p>
+    <w:p>
+      <w:pPr>
+        <w:pStyle w:val="ListBullet"/>
+        <w:ind w:left="283"/>
+      </w:pPr>
+      <w:r>
+        <w:t>Field: **DHL Tracking**  ·  Placeholder: "DHL tracking number"</w:t>
+      </w:r>
+    </w:p>
+    <w:p>
+      <w:pPr>
+        <w:pStyle w:val="ListBullet"/>
+        <w:ind w:left="283"/>
+      </w:pPr>
+      <w:r>
+        <w:t>Giá trị ví dụ: **1234567890** (10 chữ số DHL gửi chứng từ giấy tới buyer)</w:t>
+      </w:r>
+    </w:p>
+    <w:p>
+      <w:pPr>
+        <w:spacing w:before="160"/>
+      </w:pPr>
+      <w:r>
+        <w:rPr>
+          <w:b/>
+          <w:color w:val="1B4D3E"/>
+          <w:sz w:val="24"/>
+        </w:rPr>
+        <w:t>Section 💳 L/C (THƯ TÍN DỤNG)</w:t>
+      </w:r>
+    </w:p>
+    <w:tbl>
+      <w:tblPr>
+        <w:tblStyle w:val="LightGrid-Accent1"/>
+        <w:tblW w:type="auto" w:w="0"/>
+        <w:tblLook w:firstColumn="1" w:firstRow="1" w:lastColumn="0" w:lastRow="0" w:noHBand="0" w:noVBand="1" w:val="04A0"/>
+      </w:tblPr>
+      <w:tblGrid>
+        <w:gridCol w:w="3324"/>
+        <w:gridCol w:w="3324"/>
+        <w:gridCol w:w="3324"/>
+      </w:tblGrid>
+      <w:tr>
+        <w:tc>
+          <w:tcPr>
+            <w:tcW w:type="dxa" w:w="3324"/>
+          </w:tcPr>
+          <w:p>
+            <w:r>
+              <w:rPr>
+                <w:b/>
+              </w:rPr>
+              <w:t>Field</w:t>
+            </w:r>
+          </w:p>
+        </w:tc>
+        <w:tc>
+          <w:tcPr>
+            <w:tcW w:type="dxa" w:w="3324"/>
+          </w:tcPr>
+          <w:p>
+            <w:r>
+              <w:rPr>
+                <w:b/>
+              </w:rPr>
+              <w:t>Placeholder</w:t>
+            </w:r>
+          </w:p>
+        </w:tc>
+        <w:tc>
+          <w:tcPr>
+            <w:tcW w:type="dxa" w:w="3324"/>
+          </w:tcPr>
+          <w:p>
+            <w:r>
+              <w:rPr>
+                <w:b/>
+              </w:rPr>
+              <w:t>Giá trị ví dụ</w:t>
+            </w:r>
+          </w:p>
+        </w:tc>
+      </w:tr>
+      <w:tr>
+        <w:tc>
+          <w:tcPr>
+            <w:tcW w:type="dxa" w:w="3324"/>
+          </w:tcPr>
+          <w:p>
+            <w:r>
+              <w:t>Số L/C</w:t>
+            </w:r>
+          </w:p>
+        </w:tc>
+        <w:tc>
+          <w:tcPr>
+            <w:tcW w:type="dxa" w:w="3324"/>
+          </w:tcPr>
+          <w:p>
+            <w:r>
+              <w:t>L/C number</w:t>
+            </w:r>
+          </w:p>
+        </w:tc>
+        <w:tc>
+          <w:tcPr>
+            <w:tcW w:type="dxa" w:w="3324"/>
+          </w:tcPr>
+          <w:p>
+            <w:r>
+              <w:t>LC-JP-20260425-018</w:t>
+            </w:r>
+          </w:p>
+        </w:tc>
+      </w:tr>
+      <w:tr>
+        <w:tc>
+          <w:tcPr>
+            <w:tcW w:type="dxa" w:w="3324"/>
+          </w:tcPr>
+          <w:p>
+            <w:r>
+              <w:t>Ngân hàng phát hành</w:t>
+            </w:r>
+          </w:p>
+        </w:tc>
+        <w:tc>
+          <w:tcPr>
+            <w:tcW w:type="dxa" w:w="3324"/>
+          </w:tcPr>
+          <w:p>
+            <w:r>
+              <w:t>Issuing bank</w:t>
+            </w:r>
+          </w:p>
+        </w:tc>
+        <w:tc>
+          <w:tcPr>
+            <w:tcW w:type="dxa" w:w="3324"/>
+          </w:tcPr>
+          <w:p>
+            <w:r>
+              <w:t>Bank of Tokyo-Mitsubishi UFJ (MUFG), Tokyo</w:t>
+            </w:r>
+          </w:p>
+        </w:tc>
+      </w:tr>
+      <w:tr>
+        <w:tc>
+          <w:tcPr>
+            <w:tcW w:type="dxa" w:w="3324"/>
+          </w:tcPr>
+          <w:p>
+            <w:r>
+              <w:t>Hạn L/C</w:t>
+            </w:r>
+          </w:p>
+        </w:tc>
+        <w:tc>
+          <w:tcPr>
+            <w:tcW w:type="dxa" w:w="3324"/>
+          </w:tcPr>
+          <w:p>
+            <w:r>
+              <w:t>Chọn thời điểm</w:t>
+            </w:r>
+          </w:p>
+        </w:tc>
+        <w:tc>
+          <w:tcPr>
+            <w:tcW w:type="dxa" w:w="3324"/>
+          </w:tcPr>
+          <w:p>
+            <w:r>
+              <w:t>15/07/2026  (≈ 30 ngày sau ETA)</w:t>
+            </w:r>
+          </w:p>
+        </w:tc>
+      </w:tr>
+      <w:tr>
+        <w:tc>
+          <w:tcPr>
+            <w:tcW w:type="dxa" w:w="3324"/>
+          </w:tcPr>
+          <w:p>
+            <w:r>
+              <w:t>Số tiền L/C (USD)</w:t>
+            </w:r>
+          </w:p>
+        </w:tc>
+        <w:tc>
+          <w:tcPr>
+            <w:tcW w:type="dxa" w:w="3324"/>
+          </w:tcPr>
+          <w:p>
+            <w:r>
+              <w:t>USD</w:t>
+            </w:r>
+          </w:p>
+        </w:tc>
+        <w:tc>
+          <w:tcPr>
+            <w:tcW w:type="dxa" w:w="3324"/>
+          </w:tcPr>
+          <w:p>
+            <w:r>
+              <w:t>43104  (khớp total_value_usd của order)</w:t>
+            </w:r>
+          </w:p>
+        </w:tc>
+      </w:tr>
+    </w:tbl>
+    <w:p>
+      <w:r>
+        <w:rPr>
+          <w:b w:val="0"/>
+          <w:i/>
+          <w:color w:val="555555"/>
+          <w:sz w:val="20"/>
+        </w:rPr>
+        <w:t>Ghi chú: Hệ thống cảnh báo L/C sắp hết hạn ≤ 7 ngày (badge đỏ), ≤ 20 ngày (badge cam) — hiển thị trên Cash Flow page tab "L/C đang hoạt động".</w:t>
+      </w:r>
+    </w:p>
+    <w:p>
+      <w:pPr>
+        <w:spacing w:before="160"/>
+      </w:pPr>
+      <w:r>
+        <w:rPr>
+          <w:b/>
+          <w:color w:val="1B4D3E"/>
+          <w:sz w:val="24"/>
+        </w:rPr>
+        <w:t>Section 💰 ĐẶT CỌC</w:t>
+      </w:r>
+    </w:p>
+    <w:tbl>
+      <w:tblPr>
+        <w:tblStyle w:val="LightGrid-Accent1"/>
+        <w:tblW w:type="auto" w:w="0"/>
+        <w:tblLook w:firstColumn="1" w:firstRow="1" w:lastColumn="0" w:lastRow="0" w:noHBand="0" w:noVBand="1" w:val="04A0"/>
+      </w:tblPr>
+      <w:tblGrid>
+        <w:gridCol w:w="3324"/>
+        <w:gridCol w:w="3324"/>
+        <w:gridCol w:w="3324"/>
+      </w:tblGrid>
+      <w:tr>
+        <w:tc>
+          <w:tcPr>
+            <w:tcW w:type="dxa" w:w="3324"/>
+          </w:tcPr>
+          <w:p>
+            <w:r>
+              <w:rPr>
+                <w:b/>
+              </w:rPr>
+              <w:t>Field</w:t>
+            </w:r>
+          </w:p>
+        </w:tc>
+        <w:tc>
+          <w:tcPr>
+            <w:tcW w:type="dxa" w:w="3324"/>
+          </w:tcPr>
+          <w:p>
+            <w:r>
+              <w:rPr>
+                <w:b/>
+              </w:rPr>
+              <w:t>Ý nghĩa</w:t>
+            </w:r>
+          </w:p>
+        </w:tc>
+        <w:tc>
+          <w:tcPr>
+            <w:tcW w:type="dxa" w:w="3324"/>
+          </w:tcPr>
+          <w:p>
+            <w:r>
+              <w:rPr>
+                <w:b/>
+              </w:rPr>
+              <w:t>Giá trị ví dụ</w:t>
+            </w:r>
+          </w:p>
+        </w:tc>
+      </w:tr>
+      <w:tr>
+        <w:tc>
+          <w:tcPr>
+            <w:tcW w:type="dxa" w:w="3324"/>
+          </w:tcPr>
+          <w:p>
+            <w:r>
+              <w:t>Số tiền đặt cọc</w:t>
+            </w:r>
+          </w:p>
+        </w:tc>
+        <w:tc>
+          <w:tcPr>
+            <w:tcW w:type="dxa" w:w="3324"/>
+          </w:tcPr>
+          <w:p>
+            <w:r>
+              <w:t>Deposit amount (USD)</w:t>
+            </w:r>
+          </w:p>
+        </w:tc>
+        <w:tc>
+          <w:tcPr>
+            <w:tcW w:type="dxa" w:w="3324"/>
+          </w:tcPr>
+          <w:p>
+            <w:r>
+              <w:t>8620.80  (20% × 43.104)</w:t>
+            </w:r>
+          </w:p>
+        </w:tc>
+      </w:tr>
+      <w:tr>
+        <w:tc>
+          <w:tcPr>
+            <w:tcW w:type="dxa" w:w="3324"/>
+          </w:tcPr>
+          <w:p>
+            <w:r>
+              <w:t>Ngày đặt cọc</w:t>
+            </w:r>
+          </w:p>
+        </w:tc>
+        <w:tc>
+          <w:tcPr>
+            <w:tcW w:type="dxa" w:w="3324"/>
+          </w:tcPr>
+          <w:p>
+            <w:r>
+              <w:t>Deposit date</w:t>
+            </w:r>
+          </w:p>
+        </w:tc>
+        <w:tc>
+          <w:tcPr>
+            <w:tcW w:type="dxa" w:w="3324"/>
+          </w:tcPr>
+          <w:p>
+            <w:r>
+              <w:t>10/05/2026 (trước ETD 5 ngày)</w:t>
+            </w:r>
+          </w:p>
+        </w:tc>
+      </w:tr>
+      <w:tr>
+        <w:tc>
+          <w:tcPr>
+            <w:tcW w:type="dxa" w:w="3324"/>
+          </w:tcPr>
+          <w:p>
+            <w:r>
+              <w:t>Ghi chú đặt cọc</w:t>
+            </w:r>
+          </w:p>
+        </w:tc>
+        <w:tc>
+          <w:tcPr>
+            <w:tcW w:type="dxa" w:w="3324"/>
+          </w:tcPr>
+          <w:p>
+            <w:r>
+              <w:t>Deposit note (free text)</w:t>
+            </w:r>
+          </w:p>
+        </w:tc>
+        <w:tc>
+          <w:tcPr>
+            <w:tcW w:type="dxa" w:w="3324"/>
+          </w:tcPr>
+          <w:p>
+            <w:r>
+              <w:t>TT 20% via VCB 0071001046372, ref# DEPO-0018</w:t>
+            </w:r>
+          </w:p>
+        </w:tc>
+      </w:tr>
+      <w:tr>
+        <w:tc>
+          <w:tcPr>
+            <w:tcW w:type="dxa" w:w="3324"/>
+          </w:tcPr>
+          <w:p>
+            <w:r>
+              <w:t>Ngân hàng</w:t>
+            </w:r>
+          </w:p>
+        </w:tc>
+        <w:tc>
+          <w:tcPr>
+            <w:tcW w:type="dxa" w:w="3324"/>
+          </w:tcPr>
+          <w:p>
+            <w:r>
+              <w:t>Bank name (auto-fill from order)</w:t>
+            </w:r>
+          </w:p>
+        </w:tc>
+        <w:tc>
+          <w:tcPr>
+            <w:tcW w:type="dxa" w:w="3324"/>
+          </w:tcPr>
+          <w:p>
+            <w:r>
+              <w:t>Vietcombank (VCB)</w:t>
+            </w:r>
+          </w:p>
+        </w:tc>
+      </w:tr>
+    </w:tbl>
+    <w:p>
+      <w:pPr>
+        <w:spacing w:before="160"/>
+      </w:pPr>
+      <w:r>
+        <w:rPr>
+          <w:b/>
+          <w:color w:val="1B4D3E"/>
+          <w:sz w:val="24"/>
+        </w:rPr>
+        <w:t>Section 🏦 CHIẾT KHẤU (discount scroll xuống thêm)</w:t>
+      </w:r>
+    </w:p>
+    <w:tbl>
+      <w:tblPr>
+        <w:tblStyle w:val="LightGrid-Accent1"/>
+        <w:tblW w:type="auto" w:w="0"/>
+        <w:tblLook w:firstColumn="1" w:firstRow="1" w:lastColumn="0" w:lastRow="0" w:noHBand="0" w:noVBand="1" w:val="04A0"/>
+      </w:tblPr>
+      <w:tblGrid>
+        <w:gridCol w:w="3324"/>
+        <w:gridCol w:w="3324"/>
+        <w:gridCol w:w="3324"/>
+      </w:tblGrid>
+      <w:tr>
+        <w:tc>
+          <w:tcPr>
+            <w:tcW w:type="dxa" w:w="3324"/>
+          </w:tcPr>
+          <w:p>
+            <w:r>
+              <w:rPr>
+                <w:b/>
+              </w:rPr>
+              <w:t>Field</w:t>
+            </w:r>
+          </w:p>
+        </w:tc>
+        <w:tc>
+          <w:tcPr>
+            <w:tcW w:type="dxa" w:w="3324"/>
+          </w:tcPr>
+          <w:p>
+            <w:r>
+              <w:rPr>
+                <w:b/>
+              </w:rPr>
+              <w:t>Ý nghĩa</w:t>
+            </w:r>
+          </w:p>
+        </w:tc>
+        <w:tc>
+          <w:tcPr>
+            <w:tcW w:type="dxa" w:w="3324"/>
+          </w:tcPr>
+          <w:p>
+            <w:r>
+              <w:rPr>
+                <w:b/>
+              </w:rPr>
+              <w:t>Giá trị ví dụ</w:t>
+            </w:r>
+          </w:p>
+        </w:tc>
+      </w:tr>
+      <w:tr>
+        <w:tc>
+          <w:tcPr>
+            <w:tcW w:type="dxa" w:w="3324"/>
+          </w:tcPr>
+          <w:p>
+            <w:r>
+              <w:t>Ngân hàng chiết khấu</w:t>
+            </w:r>
+          </w:p>
+        </w:tc>
+        <w:tc>
+          <w:tcPr>
+            <w:tcW w:type="dxa" w:w="3324"/>
+          </w:tcPr>
+          <w:p>
+            <w:r>
+              <w:t>Discount bank — nơi mua L/C</w:t>
+            </w:r>
+          </w:p>
+        </w:tc>
+        <w:tc>
+          <w:tcPr>
+            <w:tcW w:type="dxa" w:w="3324"/>
+          </w:tcPr>
+          <w:p>
+            <w:r>
+              <w:t>Vietcombank (VCB)</w:t>
+            </w:r>
+          </w:p>
+        </w:tc>
+      </w:tr>
+      <w:tr>
+        <w:tc>
+          <w:tcPr>
+            <w:tcW w:type="dxa" w:w="3324"/>
+          </w:tcPr>
+          <w:p>
+            <w:r>
+              <w:t>Ngày chiết khấu</w:t>
+            </w:r>
+          </w:p>
+        </w:tc>
+        <w:tc>
+          <w:tcPr>
+            <w:tcW w:type="dxa" w:w="3324"/>
+          </w:tcPr>
+          <w:p>
+            <w:r>
+              <w:t>Discount date</w:t>
+            </w:r>
+          </w:p>
+        </w:tc>
+        <w:tc>
+          <w:tcPr>
+            <w:tcW w:type="dxa" w:w="3324"/>
+          </w:tcPr>
+          <w:p>
+            <w:r>
+              <w:t>05/06/2026 (sau ETD, trước ETA)</w:t>
+            </w:r>
+          </w:p>
+        </w:tc>
+      </w:tr>
+      <w:tr>
+        <w:tc>
+          <w:tcPr>
+            <w:tcW w:type="dxa" w:w="3324"/>
+          </w:tcPr>
+          <w:p>
+            <w:r>
+              <w:t>Số tiền chiết khấu</w:t>
+            </w:r>
+          </w:p>
+        </w:tc>
+        <w:tc>
+          <w:tcPr>
+            <w:tcW w:type="dxa" w:w="3324"/>
+          </w:tcPr>
+          <w:p>
+            <w:r>
+              <w:t>Discount amount (USD)</w:t>
+            </w:r>
+          </w:p>
+        </w:tc>
+        <w:tc>
+          <w:tcPr>
+            <w:tcW w:type="dxa" w:w="3324"/>
+          </w:tcPr>
+          <w:p>
+            <w:r>
+              <w:t>34.483,20  (80% × 43.104)</w:t>
+            </w:r>
+          </w:p>
+        </w:tc>
+      </w:tr>
+      <w:tr>
+        <w:tc>
+          <w:tcPr>
+            <w:tcW w:type="dxa" w:w="3324"/>
+          </w:tcPr>
+          <w:p>
+            <w:r>
+              <w:t>Phí ngân hàng</w:t>
+            </w:r>
+          </w:p>
+        </w:tc>
+        <w:tc>
+          <w:tcPr>
+            <w:tcW w:type="dxa" w:w="3324"/>
+          </w:tcPr>
+          <w:p>
+            <w:r>
+              <w:t>Bank charges (USD)</w:t>
+            </w:r>
+          </w:p>
+        </w:tc>
+        <w:tc>
+          <w:tcPr>
+            <w:tcW w:type="dxa" w:w="3324"/>
+          </w:tcPr>
+          <w:p>
+            <w:r>
+              <w:t>250  (phí thông báo + chiết khấu)</w:t>
+            </w:r>
+          </w:p>
+        </w:tc>
+      </w:tr>
+    </w:tbl>
+    <w:p>
+      <w:r>
+        <w:rPr>
+          <w:b w:val="0"/>
+          <w:i/>
+          <w:color w:val="555555"/>
+          <w:sz w:val="20"/>
+        </w:rPr>
+        <w:t>Công thức Còn lại: Thành tiền − Đặt cọc − Chiết khấu − Phí NH = 43.104 − 8.620,80 − 34.483,20 − 250 = −250 USD (phí ngân hàng chịu).</w:t>
+      </w:r>
+    </w:p>
+    <w:p>
+      <w:pPr>
+        <w:spacing w:before="160"/>
+      </w:pPr>
+      <w:r>
+        <w:rPr>
+          <w:b/>
+          <w:color w:val="1B4D3E"/>
+          <w:sz w:val="24"/>
+        </w:rPr>
+        <w:t>Thao tác test tab Vận chuyển</w:t>
+      </w:r>
+    </w:p>
+    <w:p>
+      <w:pPr>
+        <w:spacing w:before="80" w:after="40"/>
+      </w:pPr>
+      <w:r>
+        <w:rPr>
+          <w:b/>
+          <w:sz w:val="22"/>
+        </w:rPr>
+        <w:t xml:space="preserve">  Bước 1. </w:t>
+      </w:r>
+      <w:r>
+        <w:rPr>
+          <w:b/>
+          <w:color w:val="106EBE"/>
+          <w:sz w:val="22"/>
+        </w:rPr>
+        <w:t xml:space="preserve">[Hậu cần] </w:t>
+      </w:r>
+      <w:r>
+        <w:rPr>
+          <w:sz w:val="22"/>
+        </w:rPr>
+        <w:t>Mở SO-2026-0018 → tab **Vận chuyển** → click **Chỉnh sửa** (Edit icon, top right).</w:t>
+      </w:r>
+    </w:p>
+    <w:p>
+      <w:pPr>
+        <w:spacing w:after="80"/>
+        <w:ind w:left="680"/>
+      </w:pPr>
+      <w:r>
+        <w:rPr>
+          <w:i/>
+          <w:color w:val="2E7D32"/>
+          <w:sz w:val="20"/>
+        </w:rPr>
+        <w:t xml:space="preserve">→ Kỳ vọng: </w:t>
+      </w:r>
+      <w:r>
+        <w:rPr>
+          <w:i/>
+          <w:sz w:val="20"/>
+        </w:rPr>
+        <w:t>Form enter edit mode. 2 nút hiện top: **× Hủy** (text) + **Lưu** (primary xanh).</w:t>
+      </w:r>
+    </w:p>
+    <w:p>
+      <w:pPr>
+        <w:spacing w:before="80" w:after="40"/>
+      </w:pPr>
+      <w:r>
+        <w:rPr>
+          <w:b/>
+          <w:sz w:val="22"/>
+        </w:rPr>
+        <w:t xml:space="preserve">  Bước 2. </w:t>
+      </w:r>
+      <w:r>
+        <w:rPr>
+          <w:b/>
+          <w:color w:val="106EBE"/>
+          <w:sz w:val="22"/>
+        </w:rPr>
+        <w:t xml:space="preserve">[Hậu cần] </w:t>
+      </w:r>
+      <w:r>
+        <w:rPr>
+          <w:sz w:val="22"/>
+        </w:rPr>
+        <w:t>Section BOOKING &amp; TÀU: điền 3 field theo bảng trên.</w:t>
+      </w:r>
+    </w:p>
+    <w:p>
+      <w:pPr>
+        <w:spacing w:after="80"/>
+        <w:ind w:left="680"/>
+      </w:pPr>
+      <w:r>
+        <w:rPr>
+          <w:i/>
+          <w:color w:val="2E7D32"/>
+          <w:sz w:val="20"/>
+        </w:rPr>
+        <w:t xml:space="preserve">→ Kỳ vọng: </w:t>
+      </w:r>
+      <w:r>
+        <w:rPr>
+          <w:i/>
+          <w:sz w:val="20"/>
+        </w:rPr>
+        <w:t>Placeholder chuyển thành value. Focus ring xanh #1B4D3E.</w:t>
+      </w:r>
+    </w:p>
+    <w:p>
+      <w:pPr>
+        <w:spacing w:before="80" w:after="40"/>
+      </w:pPr>
+      <w:r>
+        <w:rPr>
+          <w:b/>
+          <w:sz w:val="22"/>
+        </w:rPr>
+        <w:t xml:space="preserve">  Bước 3. </w:t>
+      </w:r>
+      <w:r>
+        <w:rPr>
+          <w:b/>
+          <w:color w:val="106EBE"/>
+          <w:sz w:val="22"/>
+        </w:rPr>
+        <w:t xml:space="preserve">[Hậu cần] </w:t>
+      </w:r>
+      <w:r>
+        <w:rPr>
+          <w:sz w:val="22"/>
+        </w:rPr>
+        <w:t>Section VẬN ĐƠN (B/L): nhập B/L Number + chọn B/L Type="Original".</w:t>
+      </w:r>
+    </w:p>
+    <w:p>
+      <w:pPr>
+        <w:spacing w:after="80"/>
+        <w:ind w:left="680"/>
+      </w:pPr>
+      <w:r>
+        <w:rPr>
+          <w:i/>
+          <w:color w:val="2E7D32"/>
+          <w:sz w:val="20"/>
+        </w:rPr>
+        <w:t xml:space="preserve">→ Kỳ vọng: </w:t>
+      </w:r>
+      <w:r>
+        <w:rPr>
+          <w:i/>
+          <w:sz w:val="20"/>
+        </w:rPr>
+        <w:t>Dropdown B/L Type hiện 3 options: Original / Telex Release / Surrendered.</w:t>
+      </w:r>
+    </w:p>
+    <w:p>
+      <w:pPr>
+        <w:spacing w:before="80" w:after="40"/>
+      </w:pPr>
+      <w:r>
+        <w:rPr>
+          <w:b/>
+          <w:sz w:val="22"/>
+        </w:rPr>
+        <w:t xml:space="preserve">  Bước 4. </w:t>
+      </w:r>
+      <w:r>
+        <w:rPr>
+          <w:b/>
+          <w:color w:val="106EBE"/>
+          <w:sz w:val="22"/>
+        </w:rPr>
+        <w:t xml:space="preserve">[Hậu cần] </w:t>
+      </w:r>
+      <w:r>
+        <w:rPr>
+          <w:sz w:val="22"/>
+        </w:rPr>
+        <w:t>Section NGÀY THÁNG: DatePicker ETD=15/05, ETA=12/06, Cutoff=13/05.</w:t>
+      </w:r>
+    </w:p>
+    <w:p>
+      <w:pPr>
+        <w:spacing w:after="80"/>
+        <w:ind w:left="680"/>
+      </w:pPr>
+      <w:r>
+        <w:rPr>
+          <w:i/>
+          <w:color w:val="2E7D32"/>
+          <w:sz w:val="20"/>
+        </w:rPr>
+        <w:t xml:space="preserve">→ Kỳ vọng: </w:t>
+      </w:r>
+      <w:r>
+        <w:rPr>
+          <w:i/>
+          <w:sz w:val="20"/>
+        </w:rPr>
+        <w:t>Ngày hiển thị DD/MM/YYYY. Cutoff thường trước ETD 1-3 ngày.</w:t>
+      </w:r>
+    </w:p>
+    <w:p>
+      <w:pPr>
+        <w:spacing w:before="80" w:after="40"/>
+      </w:pPr>
+      <w:r>
+        <w:rPr>
+          <w:b/>
+          <w:sz w:val="22"/>
+        </w:rPr>
+        <w:t xml:space="preserve">  Bước 5. </w:t>
+      </w:r>
+      <w:r>
+        <w:rPr>
+          <w:b/>
+          <w:color w:val="106EBE"/>
+          <w:sz w:val="22"/>
+        </w:rPr>
+        <w:t xml:space="preserve">[Hậu cần] </w:t>
+      </w:r>
+      <w:r>
+        <w:rPr>
+          <w:sz w:val="22"/>
+        </w:rPr>
+        <w:t>DHL Tracking: điền 10 chữ số.</w:t>
+      </w:r>
+    </w:p>
+    <w:p>
+      <w:pPr>
+        <w:spacing w:after="80"/>
+        <w:ind w:left="680"/>
+      </w:pPr>
+      <w:r>
+        <w:rPr>
+          <w:i/>
+          <w:color w:val="2E7D32"/>
+          <w:sz w:val="20"/>
+        </w:rPr>
+        <w:t xml:space="preserve">→ Kỳ vọng: </w:t>
+      </w:r>
+      <w:r>
+        <w:rPr>
+          <w:i/>
+          <w:sz w:val="20"/>
+        </w:rPr>
+        <w:t>Field free-text, không validate format.</w:t>
+      </w:r>
+    </w:p>
+    <w:p>
+      <w:pPr>
+        <w:spacing w:before="80" w:after="40"/>
+      </w:pPr>
+      <w:r>
+        <w:rPr>
+          <w:b/>
+          <w:sz w:val="22"/>
+        </w:rPr>
+        <w:t xml:space="preserve">  Bước 6. </w:t>
+      </w:r>
+      <w:r>
+        <w:rPr>
+          <w:b/>
+          <w:color w:val="106EBE"/>
+          <w:sz w:val="22"/>
+        </w:rPr>
+        <w:t xml:space="preserve">[Hậu cần] </w:t>
+      </w:r>
+      <w:r>
+        <w:rPr>
+          <w:sz w:val="22"/>
+        </w:rPr>
+        <w:t>Section L/C: điền 4 field. Chú ý **Hạn L/C** = 15/07/2026.</w:t>
+      </w:r>
+    </w:p>
+    <w:p>
+      <w:pPr>
+        <w:spacing w:after="80"/>
+        <w:ind w:left="680"/>
+      </w:pPr>
+      <w:r>
+        <w:rPr>
+          <w:i/>
+          <w:color w:val="2E7D32"/>
+          <w:sz w:val="20"/>
+        </w:rPr>
+        <w:t xml:space="preserve">→ Kỳ vọng: </w:t>
+      </w:r>
+      <w:r>
+        <w:rPr>
+          <w:i/>
+          <w:sz w:val="20"/>
+        </w:rPr>
+        <w:t>Nếu Hạn L/C ≤ 7 ngày từ today, hiện badge đỏ "L/C SẮP HẾT" ngay bên cạnh field.</w:t>
+      </w:r>
+    </w:p>
+    <w:p>
+      <w:pPr>
+        <w:spacing w:before="80" w:after="40"/>
+      </w:pPr>
+      <w:r>
+        <w:rPr>
+          <w:b/>
+          <w:sz w:val="22"/>
+        </w:rPr>
+        <w:t xml:space="preserve">  Bước 7. </w:t>
+      </w:r>
+      <w:r>
+        <w:rPr>
+          <w:b/>
+          <w:color w:val="106EBE"/>
+          <w:sz w:val="22"/>
+        </w:rPr>
+        <w:t xml:space="preserve">[Hậu cần] </w:t>
+      </w:r>
+      <w:r>
+        <w:rPr>
+          <w:sz w:val="22"/>
+        </w:rPr>
+        <w:t>Section ĐẶT CỌC: Deposit amount=8620.80, Date=10/05, Note="TT 20% via VCB...".</w:t>
+      </w:r>
+    </w:p>
+    <w:p>
+      <w:pPr>
+        <w:spacing w:after="80"/>
+        <w:ind w:left="680"/>
+      </w:pPr>
+      <w:r>
+        <w:rPr>
+          <w:i/>
+          <w:color w:val="2E7D32"/>
+          <w:sz w:val="20"/>
+        </w:rPr>
+        <w:t xml:space="preserve">→ Kỳ vọng: </w:t>
+      </w:r>
+      <w:r>
+        <w:rPr>
+          <w:i/>
+          <w:sz w:val="20"/>
+        </w:rPr>
+        <w:t>Số tiền full với dấu chấm thập phân. KHÔNG rút gọn "8.6K".</w:t>
+      </w:r>
+    </w:p>
+    <w:p>
+      <w:pPr>
+        <w:spacing w:before="80" w:after="40"/>
+      </w:pPr>
+      <w:r>
+        <w:rPr>
+          <w:b/>
+          <w:sz w:val="22"/>
+        </w:rPr>
+        <w:t xml:space="preserve">  Bước 8. </w:t>
+      </w:r>
+      <w:r>
+        <w:rPr>
+          <w:b/>
+          <w:color w:val="106EBE"/>
+          <w:sz w:val="22"/>
+        </w:rPr>
+        <w:t xml:space="preserve">[Hậu cần] </w:t>
+      </w:r>
+      <w:r>
+        <w:rPr>
+          <w:sz w:val="22"/>
+        </w:rPr>
+        <w:t>Scroll xuống CHIẾT KHẤU → điền 4 field. Click nút **Lưu** (primary xanh, SaveOutlined).</w:t>
+      </w:r>
+    </w:p>
+    <w:p>
+      <w:pPr>
+        <w:spacing w:after="80"/>
+        <w:ind w:left="680"/>
+      </w:pPr>
+      <w:r>
+        <w:rPr>
+          <w:i/>
+          <w:color w:val="2E7D32"/>
+          <w:sz w:val="20"/>
+        </w:rPr>
+        <w:t xml:space="preserve">→ Kỳ vọng: </w:t>
+      </w:r>
+      <w:r>
+        <w:rPr>
+          <w:i/>
+          <w:sz w:val="20"/>
+        </w:rPr>
+        <w:t>Toast xanh "Đã cập nhật thông tin vận chuyển". View mode refresh. Descriptions hiện tất cả values vừa điền.</w:t>
+      </w:r>
+    </w:p>
+    <w:p>
+      <w:pPr>
+        <w:spacing w:before="80" w:after="40"/>
+      </w:pPr>
+      <w:r>
+        <w:rPr>
+          <w:b/>
+          <w:sz w:val="22"/>
+        </w:rPr>
+        <w:t xml:space="preserve">  Bước 9. </w:t>
+      </w:r>
+      <w:r>
+        <w:rPr>
+          <w:b/>
+          <w:color w:val="555555"/>
+          <w:sz w:val="22"/>
+        </w:rPr>
+        <w:t xml:space="preserve">[SQL] </w:t>
+      </w:r>
+      <w:r>
+        <w:rPr>
+          <w:sz w:val="22"/>
+        </w:rPr>
+        <w:t>SELECT code, shipping_line, vessel_name, booking_reference, bl_number, bl_type, etd, eta, cutoff_date, dhl_number, lc_number, lc_bank, lc_expiry_date, lc_amount, deposit_amount, deposit_date, bank_charges FROM sales_orders WHERE code='SO-2026-0018';</w:t>
+      </w:r>
+    </w:p>
+    <w:p>
+      <w:pPr>
+        <w:spacing w:after="80"/>
+        <w:ind w:left="680"/>
+      </w:pPr>
+      <w:r>
+        <w:rPr>
+          <w:i/>
+          <w:color w:val="2E7D32"/>
+          <w:sz w:val="20"/>
+        </w:rPr>
+        <w:t xml:space="preserve">→ Kỳ vọng: </w:t>
+      </w:r>
+      <w:r>
+        <w:rPr>
+          <w:i/>
+          <w:sz w:val="20"/>
+        </w:rPr>
+        <w:t>Tất cả 17 field có giá trị đúng. lc_expiry_date &gt; CURRENT_DATE.</w:t>
+      </w:r>
+    </w:p>
+    <w:p>
+      <w:pPr>
+        <w:spacing w:before="80" w:after="40"/>
+      </w:pPr>
+      <w:r>
+        <w:rPr>
+          <w:b/>
+          <w:sz w:val="22"/>
+        </w:rPr>
+        <w:t xml:space="preserve">  Bước 10. </w:t>
+      </w:r>
+      <w:r>
+        <w:rPr>
+          <w:b/>
+          <w:color w:val="721B6E"/>
+          <w:sz w:val="22"/>
+        </w:rPr>
+        <w:t xml:space="preserve">[Kế toán] </w:t>
+      </w:r>
+      <w:r>
+        <w:rPr>
+          <w:sz w:val="22"/>
+        </w:rPr>
+        <w:t>Đổi role=accounting → mở Cash Flow page → tab **L/C đang hoạt động** → tìm SO-2026-0018.</w:t>
+      </w:r>
+    </w:p>
+    <w:p>
+      <w:pPr>
+        <w:spacing w:after="80"/>
+        <w:ind w:left="680"/>
+      </w:pPr>
+      <w:r>
+        <w:rPr>
+          <w:i/>
+          <w:color w:val="2E7D32"/>
+          <w:sz w:val="20"/>
+        </w:rPr>
+        <w:t xml:space="preserve">→ Kỳ vọng: </w:t>
+      </w:r>
+      <w:r>
+        <w:rPr>
+          <w:i/>
+          <w:sz w:val="20"/>
+        </w:rPr>
+        <w:t>Row hiện với LC-JP-20260425-018, Bank MUFG, Amount 43.104 USD, days_until_expiry ≈ 85 ngày.</w:t>
+      </w:r>
+    </w:p>
+    <w:p>
+      <w:pPr>
+        <w:spacing w:before="160"/>
+      </w:pPr>
+      <w:r>
+        <w:rPr>
+          <w:b/>
+          <w:color w:val="1B4D3E"/>
+          <w:sz w:val="24"/>
+        </w:rPr>
+        <w:t>Pass/Fail criteria</w:t>
+      </w:r>
+    </w:p>
+    <w:p>
+      <w:r>
+        <w:rPr>
+          <w:b/>
+          <w:color w:val="2E7D32"/>
+        </w:rPr>
+        <w:t>PASS khi:</w:t>
+      </w:r>
+    </w:p>
+    <w:p>
+      <w:pPr>
+        <w:pStyle w:val="ListBullet"/>
+        <w:ind w:left="283"/>
+      </w:pPr>
+      <w:r>
+        <w:t>Save toast xanh</w:t>
+      </w:r>
+    </w:p>
+    <w:p>
+      <w:pPr>
+        <w:pStyle w:val="ListBullet"/>
+        <w:ind w:left="283"/>
+      </w:pPr>
+      <w:r>
+        <w:t>17 field lưu DB đúng</w:t>
+      </w:r>
+    </w:p>
+    <w:p>
+      <w:pPr>
+        <w:pStyle w:val="ListBullet"/>
+        <w:ind w:left="283"/>
+      </w:pPr>
+      <w:r>
+        <w:t>LC warning nếu expiry ≤ 7 ngày</w:t>
+      </w:r>
+    </w:p>
+    <w:p>
+      <w:pPr>
+        <w:pStyle w:val="ListBullet"/>
+        <w:ind w:left="283"/>
+      </w:pPr>
+      <w:r>
+        <w:t>View mode Descriptions đầy đủ</w:t>
+      </w:r>
+    </w:p>
+    <w:p>
+      <w:pPr>
+        <w:pStyle w:val="ListBullet"/>
+        <w:ind w:left="283"/>
+      </w:pPr>
+      <w:r>
+        <w:t>Cash Flow page thấy LC row</w:t>
+      </w:r>
+    </w:p>
+    <w:p>
+      <w:r>
+        <w:rPr>
+          <w:b/>
+          <w:color w:val="C62828"/>
+        </w:rPr>
+        <w:t>FAIL khi:</w:t>
+      </w:r>
+    </w:p>
+    <w:p>
+      <w:pPr>
+        <w:pStyle w:val="ListBullet"/>
+        <w:ind w:left="283"/>
+      </w:pPr>
+      <w:r>
+        <w:t>Save fail 400 (RLS/CHECK)</w:t>
+      </w:r>
+    </w:p>
+    <w:p>
+      <w:pPr>
+        <w:pStyle w:val="ListBullet"/>
+        <w:ind w:left="283"/>
+      </w:pPr>
+      <w:r>
+        <w:t>DatePicker cho nhập Hạn L/C &lt; today</w:t>
+      </w:r>
+    </w:p>
+    <w:p>
+      <w:pPr>
+        <w:pStyle w:val="ListBullet"/>
+        <w:ind w:left="283"/>
+      </w:pPr>
+      <w:r>
+        <w:t>LC warning không fire ≤ 7 ngày</w:t>
+      </w:r>
+    </w:p>
+    <w:p>
+      <w:pPr>
+        <w:pStyle w:val="ListBullet"/>
+        <w:ind w:left="283"/>
+      </w:pPr>
+      <w:r>
+        <w:t>Deposit &gt; total_value</w:t>
       </w:r>
     </w:p>
     <w:p>

</xml_diff>